<commit_message>
Add Bahasa ad groups to month-1 proposal
Co-Authored-By: Claude Opus 5.5 <noreply@anthropic.com>
Claude-Session: https://claude.ai/code/session_01AMX6WP1gVBqcfWQ3cEzkeu
</commit_message>
<xml_diff>
--- a/thermer-ua-month1-proposal.docx
+++ b/thermer-ua-month1-proposal.docx
@@ -34,7 +34,7 @@
         <w:t xml:space="preserve"> </w:t>
       </w:r>
       <w:r>
-        <w:t xml:space="preserve">6–7 hours a week (about 10–12 in week 1 for setup), mostly weekdays, with quick checks on other days after any change. Actual vs. planned hours go in every weekly report. Scope for month 1 is Google Ads only, no creatives. We review hours and scope at the end of the month, or sooner if Meta or creatives are added.</w:t>
+        <w:t xml:space="preserve">6–7 hours a week (about 10–12 in week 1 for setup), mostly weekdays, with quick checks on other days after any change. Actual vs. planned hours go in every weekly report. Scope for month 1 is Google Ads only, with no image or video creatives (ad text only). We review hours and scope at the end of the month, or sooner if Meta or creatives are added.</w:t>
       </w:r>
     </w:p>
     <w:bookmarkStart w:id="20" w:name="how-ill-follow-the-sop"/>
@@ -536,7 +536,7 @@
         <w:t xml:space="preserve"> </w:t>
       </w:r>
       <w:r>
-        <w:t xml:space="preserve">Target CPA ₹2.60 → ₹2.08; pause the two weakest ad groups; cap the budget at ₹4,000/day; clean up conversion goals once tracking is fixed. Each with hypothesis, guardrails, maximum spend and a written decision.</w:t>
+        <w:t xml:space="preserve">Target CPA ₹2.60 → ₹2.08; add a few ad groups with Bahasa Indonesia headlines and descriptions (all current ad text is English, though the campaign only targets Indonesia), within the existing budget; pause the two weakest ad groups; cap the budget at ₹4,000/day; clean up conversion goals once tracking is fixed. Each with hypothesis, guardrails, maximum spend and a written decision.</w:t>
       </w:r>
     </w:p>
     <w:p>

</xml_diff>

<commit_message>
Update month-1 proposal: Bahasa ad groups, hold install volume
Co-Authored-By: Claude Opus 5.5 <noreply@anthropic.com>
Claude-Session: https://claude.ai/code/session_01AMX6WP1gVBqcfWQ3cEzkeu
</commit_message>
<xml_diff>
--- a/thermer-ua-month1-proposal.docx
+++ b/thermer-ua-month1-proposal.docx
@@ -325,7 +325,7 @@
               <w:jc w:val="left"/>
             </w:pPr>
             <w:r>
-              <w:t xml:space="preserve">≤ ₹1.60</w:t>
+              <w:t xml:space="preserve">≤ ₹1.70</w:t>
             </w:r>
           </w:p>
         </w:tc>
@@ -363,7 +363,7 @@
               <w:jc w:val="left"/>
             </w:pPr>
             <w:r>
-              <w:t xml:space="preserve">≥ 1,700</w:t>
+              <w:t xml:space="preserve">≥ 1,900 (no drop)</w:t>
             </w:r>
           </w:p>
         </w:tc>
@@ -536,7 +536,7 @@
         <w:t xml:space="preserve"> </w:t>
       </w:r>
       <w:r>
-        <w:t xml:space="preserve">Target CPA ₹2.60 → ₹2.08; add a few ad groups with Bahasa Indonesia headlines and descriptions (all current ad text is English, though the campaign only targets Indonesia), within the existing budget; pause the two weakest ad groups; cap the budget at ₹4,000/day; clean up conversion goals once tracking is fixed. Each with hypothesis, guardrails, maximum spend and a written decision.</w:t>
+        <w:t xml:space="preserve">Target CPA ₹2.60 → ₹2.35 (−10%), with a further step only if install volume holds; add a few ad groups with Bahasa Indonesia headlines and descriptions (all current ad text is English, though the campaign only targets Indonesia), within the existing budget; pause the two weakest ad groups (₹3.1+ per install vs ₹2.31 for the best) and shift their spend to stronger ones; cap the budget at ₹4,000/day; clean up conversion goals once tracking is fixed. Each with hypothesis, guardrails, maximum spend and a written decision.</w:t>
       </w:r>
     </w:p>
     <w:p>

</xml_diff>